<commit_message>
Update civil lawsuit document with revised defendant information and case details
</commit_message>
<xml_diff>
--- a/4-其他/维权/SS财产受侵害/起诉/民事起诉状.docx
+++ b/4-其他/维权/SS财产受侵害/起诉/民事起诉状.docx
@@ -4,12 +4,12 @@
   <w:body>
     <w:p>
       <w:pPr>
-        <w:spacing w:before="0" w:after="120"/>
+        <w:spacing w:before="0" w:after="240"/>
         <w:jc w:val="center"/>
       </w:pPr>
       <w:r>
         <w:rPr>
-          <w:rFonts w:ascii="宋体" w:hAnsi="宋体" w:eastAsia="宋体"/>
+          <w:rFonts w:ascii="方正小标宋简体" w:hAnsi="方正小标宋简体" w:eastAsia="方正小标宋简体"/>
           <w:b/>
           <w:sz w:val="44"/>
         </w:rPr>
@@ -18,33 +18,27 @@
     </w:p>
     <w:p>
       <w:pPr>
-        <w:spacing w:before="0" w:after="200"/>
+        <w:spacing w:before="0" w:after="120"/>
         <w:jc w:val="center"/>
       </w:pPr>
       <w:r>
         <w:rPr>
-          <w:rFonts w:ascii="宋体" w:hAnsi="宋体" w:eastAsia="宋体"/>
+          <w:rFonts w:ascii="仿宋_GB2312" w:hAnsi="仿宋_GB2312" w:eastAsia="仿宋_GB2312"/>
           <w:b w:val="0"/>
-          <w:sz w:val="24"/>
+          <w:sz w:val="28"/>
         </w:rPr>
         <w:t>案由：不当得利纠纷</w:t>
       </w:r>
     </w:p>
     <w:p>
       <w:pPr>
-        <w:spacing w:before="0" w:after="0"/>
-        <w:pBdr>
-          <w:bottom w:val="single" w:sz="4" w:space="1" w:color="auto"/>
-        </w:pBdr>
-      </w:pPr>
-    </w:p>
-    <w:p>
-      <w:pPr>
-        <w:spacing w:before="120" w:after="80"/>
+        <w:spacing w:before="120" w:after="40"/>
+        <w:ind w:firstLine="0"/>
+        <w:jc w:val="left"/>
       </w:pPr>
       <w:r>
         <w:rPr>
-          <w:rFonts w:ascii="宋体" w:hAnsi="宋体" w:eastAsia="宋体"/>
+          <w:rFonts w:ascii="黑体" w:hAnsi="黑体" w:eastAsia="黑体"/>
           <w:b/>
           <w:sz w:val="28"/>
         </w:rPr>
@@ -53,61 +47,82 @@
     </w:p>
     <w:p>
       <w:pPr>
-        <w:spacing w:before="0" w:after="80"/>
-        <w:ind w:firstLine="480"/>
+        <w:spacing w:before="0" w:after="40" w:line="560" w:lineRule="exact"/>
+        <w:ind w:firstLine="560"/>
+        <w:jc w:val="left"/>
       </w:pPr>
       <w:r>
         <w:rPr>
-          <w:rFonts w:ascii="宋体" w:hAnsi="宋体" w:eastAsia="宋体"/>
+          <w:rFonts w:ascii="仿宋_GB2312" w:hAnsi="仿宋_GB2312" w:eastAsia="仿宋_GB2312"/>
+          <w:b/>
+          <w:sz w:val="28"/>
+        </w:rPr>
+        <w:t>原告：</w:t>
+      </w:r>
+      <w:r>
+        <w:rPr>
+          <w:rFonts w:ascii="仿宋_GB2312" w:hAnsi="仿宋_GB2312" w:eastAsia="仿宋_GB2312"/>
           <w:b w:val="0"/>
-          <w:sz w:val="24"/>
+          <w:sz w:val="28"/>
         </w:rPr>
-        <w:t>原告：孙瑞河，男，身份证号 229004196510282012，联系电话 13596290518，现住夕阳福老年服务中心。</w:t>
+        <w:t>孙瑞河，男，身份证号 229004196510282012，联系电话 13596290518，现住夕阳福老年服务中心。</w:t>
       </w:r>
     </w:p>
     <w:p>
       <w:pPr>
-        <w:spacing w:before="0" w:after="80"/>
-        <w:ind w:firstLine="480"/>
+        <w:spacing w:before="0" w:after="40" w:line="560" w:lineRule="exact"/>
+        <w:ind w:firstLine="560"/>
+        <w:jc w:val="left"/>
       </w:pPr>
       <w:r>
         <w:rPr>
-          <w:rFonts w:ascii="宋体" w:hAnsi="宋体" w:eastAsia="宋体"/>
+          <w:rFonts w:ascii="仿宋_GB2312" w:hAnsi="仿宋_GB2312" w:eastAsia="仿宋_GB2312"/>
+          <w:b/>
+          <w:sz w:val="28"/>
+        </w:rPr>
+        <w:t>委托诉讼代理人：</w:t>
+      </w:r>
+      <w:r>
+        <w:rPr>
+          <w:rFonts w:ascii="仿宋_GB2312" w:hAnsi="仿宋_GB2312" w:eastAsia="仿宋_GB2312"/>
           <w:b w:val="0"/>
-          <w:sz w:val="24"/>
+          <w:sz w:val="28"/>
         </w:rPr>
-        <w:t>委托诉讼代理人：孙景峰，男，身份证号 220282199405205619，联系电话 19524603214，系原告之子。</w:t>
+        <w:t>孙景峰，男，身份证号 220282199405205619，联系电话 19524603214，系原告之子。</w:t>
       </w:r>
     </w:p>
     <w:p>
       <w:pPr>
-        <w:spacing w:before="0" w:after="80"/>
-        <w:ind w:firstLine="480"/>
+        <w:spacing w:before="0" w:after="40" w:line="560" w:lineRule="exact"/>
+        <w:ind w:firstLine="560"/>
+        <w:jc w:val="left"/>
       </w:pPr>
       <w:r>
         <w:rPr>
-          <w:rFonts w:ascii="宋体" w:hAnsi="宋体" w:eastAsia="宋体"/>
+          <w:rFonts w:ascii="仿宋_GB2312" w:hAnsi="仿宋_GB2312" w:eastAsia="仿宋_GB2312"/>
+          <w:b/>
+          <w:sz w:val="28"/>
+        </w:rPr>
+        <w:t>被告：</w:t>
+      </w:r>
+      <w:r>
+        <w:rPr>
+          <w:rFonts w:ascii="仿宋_GB2312" w:hAnsi="仿宋_GB2312" w:eastAsia="仿宋_GB2312"/>
           <w:b w:val="0"/>
-          <w:sz w:val="24"/>
+          <w:sz w:val="28"/>
         </w:rPr>
-        <w:t>被告：张政芹，女，身份证号 220282196512165620，联系电话 15981227695，住址暂不详，待进一步核实补充。</w:t>
+        <w:t>张政芹，女，身份证号 220282196512165620，联系电话 15981227695，系原告前妻，住址暂不详，待进一步核实补充。</w:t>
       </w:r>
     </w:p>
     <w:p>
       <w:pPr>
-        <w:spacing w:before="0" w:after="0"/>
-        <w:pBdr>
-          <w:bottom w:val="single" w:sz="4" w:space="1" w:color="auto"/>
-        </w:pBdr>
-      </w:pPr>
-    </w:p>
-    <w:p>
-      <w:pPr>
-        <w:spacing w:before="120" w:after="80"/>
+        <w:spacing w:before="120" w:after="40"/>
+        <w:ind w:firstLine="0"/>
+        <w:jc w:val="left"/>
       </w:pPr>
       <w:r>
         <w:rPr>
-          <w:rFonts w:ascii="宋体" w:hAnsi="宋体" w:eastAsia="宋体"/>
+          <w:rFonts w:ascii="黑体" w:hAnsi="黑体" w:eastAsia="黑体"/>
           <w:b/>
           <w:sz w:val="28"/>
         </w:rPr>
@@ -116,61 +131,58 @@
     </w:p>
     <w:p>
       <w:pPr>
-        <w:spacing w:before="0" w:after="80"/>
-        <w:ind w:firstLine="480"/>
+        <w:spacing w:before="0" w:after="80" w:line="560" w:lineRule="exact"/>
+        <w:ind w:firstLine="560"/>
+        <w:jc w:val="both"/>
       </w:pPr>
       <w:r>
         <w:rPr>
-          <w:rFonts w:ascii="宋体" w:hAnsi="宋体" w:eastAsia="宋体"/>
+          <w:rFonts w:ascii="仿宋_GB2312" w:hAnsi="仿宋_GB2312" w:eastAsia="仿宋_GB2312"/>
           <w:b w:val="0"/>
-          <w:sz w:val="24"/>
+          <w:sz w:val="28"/>
         </w:rPr>
         <w:t>1. 判令被告向原告返还不当得利款人民币 450000 元。</w:t>
       </w:r>
     </w:p>
     <w:p>
       <w:pPr>
-        <w:spacing w:before="0" w:after="80"/>
-        <w:ind w:firstLine="480"/>
+        <w:spacing w:before="0" w:after="80" w:line="560" w:lineRule="exact"/>
+        <w:ind w:firstLine="560"/>
+        <w:jc w:val="both"/>
       </w:pPr>
       <w:r>
         <w:rPr>
-          <w:rFonts w:ascii="宋体" w:hAnsi="宋体" w:eastAsia="宋体"/>
+          <w:rFonts w:ascii="仿宋_GB2312" w:hAnsi="仿宋_GB2312" w:eastAsia="仿宋_GB2312"/>
           <w:b w:val="0"/>
-          <w:sz w:val="24"/>
+          <w:sz w:val="28"/>
         </w:rPr>
         <w:t>2. 判令被告以 450000 元为基数，自 2026 年 2 月 25 日起按同期一年期贷款市场报价利率计算资金占用利息，直至实际清偿之日止。</w:t>
       </w:r>
     </w:p>
     <w:p>
       <w:pPr>
-        <w:spacing w:before="0" w:after="80"/>
-        <w:ind w:firstLine="480"/>
+        <w:spacing w:before="0" w:after="80" w:line="560" w:lineRule="exact"/>
+        <w:ind w:firstLine="560"/>
+        <w:jc w:val="both"/>
       </w:pPr>
       <w:r>
         <w:rPr>
-          <w:rFonts w:ascii="宋体" w:hAnsi="宋体" w:eastAsia="宋体"/>
+          <w:rFonts w:ascii="仿宋_GB2312" w:hAnsi="仿宋_GB2312" w:eastAsia="仿宋_GB2312"/>
           <w:b w:val="0"/>
-          <w:sz w:val="24"/>
+          <w:sz w:val="28"/>
         </w:rPr>
         <w:t>3. 判令被告承担本案全部诉讼费用。</w:t>
       </w:r>
     </w:p>
     <w:p>
       <w:pPr>
-        <w:spacing w:before="0" w:after="0"/>
-        <w:pBdr>
-          <w:bottom w:val="single" w:sz="4" w:space="1" w:color="auto"/>
-        </w:pBdr>
-      </w:pPr>
-    </w:p>
-    <w:p>
-      <w:pPr>
-        <w:spacing w:before="120" w:after="80"/>
+        <w:spacing w:before="120" w:after="40"/>
+        <w:ind w:firstLine="0"/>
+        <w:jc w:val="left"/>
       </w:pPr>
       <w:r>
         <w:rPr>
-          <w:rFonts w:ascii="宋体" w:hAnsi="宋体" w:eastAsia="宋体"/>
+          <w:rFonts w:ascii="黑体" w:hAnsi="黑体" w:eastAsia="黑体"/>
           <w:b/>
           <w:sz w:val="28"/>
         </w:rPr>
@@ -179,117 +191,133 @@
     </w:p>
     <w:p>
       <w:pPr>
-        <w:spacing w:before="0" w:after="80"/>
-        <w:ind w:firstLine="480"/>
+        <w:spacing w:before="0" w:after="80" w:line="560" w:lineRule="exact"/>
+        <w:ind w:firstLine="560"/>
+        <w:jc w:val="both"/>
       </w:pPr>
       <w:r>
         <w:rPr>
-          <w:rFonts w:ascii="宋体" w:hAnsi="宋体" w:eastAsia="宋体"/>
+          <w:rFonts w:ascii="仿宋_GB2312" w:hAnsi="仿宋_GB2312" w:eastAsia="仿宋_GB2312"/>
           <w:b w:val="0"/>
-          <w:sz w:val="24"/>
+          <w:sz w:val="28"/>
         </w:rPr>
-        <w:t>1. 2026 年 2 月 25 日，原告名下住房公积金账户发生销户提取。现有住房公积金账户录屏材料显示，该账户姓名为孙瑞河，账号为 777074552456，缴存单位为国家税务总局桦甸市税务局，该账户于 2026 年 2 月 25 日发生销户提取，提取后账户余额变为 0。</w:t>
+        <w:t>1. 原告与被告曾系夫妻关系，后已离婚。离婚后，被告对原告个人名下财产不当然享有占有、管理或处分权。原告曾发生脑梗，目前居住于养老机构，神志时而清楚、时而糊涂，处理复杂财产事务的能力明显下降。案发前后，原告名下身份证、银行卡及相关账户工具实际由被告控制、掌握或持有。原告客观上难以自行查询、管理和支配账户资金。上述情况，系被告能够实际接触并转移案涉公积金款项的重要事实背景。</w:t>
       </w:r>
     </w:p>
     <w:p>
       <w:pPr>
-        <w:spacing w:before="0" w:after="80"/>
-        <w:ind w:firstLine="480"/>
+        <w:spacing w:before="0" w:after="80" w:line="560" w:lineRule="exact"/>
+        <w:ind w:firstLine="560"/>
+        <w:jc w:val="both"/>
       </w:pPr>
       <w:r>
         <w:rPr>
-          <w:rFonts w:ascii="宋体" w:hAnsi="宋体" w:eastAsia="宋体"/>
+          <w:rFonts w:ascii="仿宋_GB2312" w:hAnsi="仿宋_GB2312" w:eastAsia="仿宋_GB2312"/>
           <w:b w:val="0"/>
-          <w:sz w:val="24"/>
+          <w:sz w:val="28"/>
         </w:rPr>
-        <w:t>2. 现有银行收支详情截图进一步显示：2026 年 2 月 25 日 13 时 21 分 22 秒，尾号 8076 的银行卡收到一笔“公积金付”入账 459591.83 元，付款方为吉林市住房公积金管理中心；同日 14 时 18 分 04 秒，该银行卡转出 450000 元，收款方明确显示为张政芹，收款账户尾号显示为 9075，收款银行显示为农业银行，转出后账户余额为 9593.43 元。</w:t>
+        <w:t>2. 2026 年 2 月 25 日，原告名下住房公积金账户发生销户提取。现有住房公积金账户录屏材料显示，该账户姓名为孙瑞河，账号为 777074552456，缴存单位为国家税务总局桦甸市税务局，该账户于 2026 年 2 月 25 日发生销户提取，提取后账户余额变为 0。原告出生于 1965 年 10 月 28 日，案涉提取发生时已年满 60 周岁，客观上存在按退休情形办理公积金销户提取的背景。但原告本人并未亲自办理该次销户提取，也未授权被告代为办理。结合原告当时认知、判断能力存在明显波动，以及 2026 年 2 月 25 日前后被告曾带原告到医院看病、掌握原告身份信息和账户工具等情况，原告有理由认为，被告系利用带原告就医等机会，以相应理由诱导原告在不知情的情况下完成签字、刷脸等身份认证，并据此办理、控制案涉公积金提取流程。关于该次销户提取在公积金中心端具体以何种申请事由、提交何种材料、通过何种方式办理完成，原告将在案件审理过程中依法申请调取相关办理材料进一步查明。</w:t>
       </w:r>
     </w:p>
     <w:p>
       <w:pPr>
-        <w:spacing w:before="0" w:after="80"/>
-        <w:ind w:firstLine="480"/>
+        <w:spacing w:before="0" w:after="80" w:line="560" w:lineRule="exact"/>
+        <w:ind w:firstLine="560"/>
+        <w:jc w:val="both"/>
       </w:pPr>
       <w:r>
         <w:rPr>
-          <w:rFonts w:ascii="宋体" w:hAnsi="宋体" w:eastAsia="宋体"/>
+          <w:rFonts w:ascii="仿宋_GB2312" w:hAnsi="仿宋_GB2312" w:eastAsia="仿宋_GB2312"/>
           <w:b w:val="0"/>
-          <w:sz w:val="24"/>
+          <w:sz w:val="28"/>
         </w:rPr>
-        <w:t>3. 原告并未授权被告提取、占有或处分上述款项。现有聊天记录显示，原告在被询问“你没授权其他人取出来吧”时明确回复“没有”，足以证明原告对涉案款项提取、转移行为并未作出授权。</w:t>
+        <w:t>3. 现有银行收支详情截图进一步显示：2026 年 2 月 25 日 13 时 21 分 22 秒，尾号 8076 的银行卡收到一笔“公积金付”入账 459591.83 元，付款方为吉林市住房公积金管理中心。2026 年 2 月 25 日 14 时 18 分 04 秒，该银行卡又转出 450000 元，收款方明确显示为张政芹，收款账户尾号显示为 9075，收款银行显示为农业银行，转出后账户余额为 9593.43 元。据此可见，案涉公积金款项在进入原告名下银行卡后不足 1 小时，即被转入被告本人账户。结合前述被告实际控制原告银行卡及账户工具的事实，可以认定被告具备取得、控制并转移该笔资金的现实条件。</w:t>
       </w:r>
     </w:p>
     <w:p>
       <w:pPr>
-        <w:spacing w:before="0" w:after="80"/>
-        <w:ind w:firstLine="480"/>
+        <w:spacing w:before="0" w:after="80" w:line="560" w:lineRule="exact"/>
+        <w:ind w:firstLine="560"/>
+        <w:jc w:val="both"/>
       </w:pPr>
       <w:r>
         <w:rPr>
-          <w:rFonts w:ascii="宋体" w:hAnsi="宋体" w:eastAsia="宋体"/>
+          <w:rFonts w:ascii="仿宋_GB2312" w:hAnsi="仿宋_GB2312" w:eastAsia="仿宋_GB2312"/>
           <w:b w:val="0"/>
-          <w:sz w:val="24"/>
+          <w:sz w:val="28"/>
         </w:rPr>
-        <w:t>4. 被告在聊天记录中并未否认其取得并控制涉案款项，反而作出多次不利于其自身的明确陈述，包括但不限于“取了，又存了咋了”“没动，又存上了”“40 万是定期的”“放心吧，这个钱都给你俩”“近 45”“那 5 万呢”“装修房子用了”等内容。结合前述入账、转账截图，可以相互印证被告已实际取得并控制至少 450000 元原告款项，并对其中部分款项进行了处分，且拒绝立即返还。</w:t>
+        <w:t>4. 原告并未授权被告提取、占有或处分上述款项。现有聊天记录显示，原告在被询问“你没授权其他人取出来吧”时明确回复“没有”，足以证明原告对涉案公积金销户提取、到账接收及后续向被告账户转移等行为均未作出授权。</w:t>
       </w:r>
     </w:p>
     <w:p>
       <w:pPr>
-        <w:spacing w:before="0" w:after="80"/>
-        <w:ind w:firstLine="480"/>
+        <w:spacing w:before="0" w:after="80" w:line="560" w:lineRule="exact"/>
+        <w:ind w:firstLine="560"/>
+        <w:jc w:val="both"/>
       </w:pPr>
       <w:r>
         <w:rPr>
-          <w:rFonts w:ascii="宋体" w:hAnsi="宋体" w:eastAsia="宋体"/>
+          <w:rFonts w:ascii="仿宋_GB2312" w:hAnsi="仿宋_GB2312" w:eastAsia="仿宋_GB2312"/>
           <w:b w:val="0"/>
-          <w:sz w:val="24"/>
+          <w:sz w:val="28"/>
         </w:rPr>
-        <w:t>5. 被告取得并占有原告上述款项，无法律依据。即便其主张系代为保管、代为支配或用于其他用途，亦未取得原告合法、真实、有效授权。其在明知该款项属于原告个人财产的情况下仍实际占有并处分，已经构成无法律根据取得利益并致原告受损，依法应向原告返还。</w:t>
+        <w:t>5. 被告在聊天记录中并未否认其取得并控制涉案款项，反而作出多次不利于其自身的明确陈述，包括但不限于“取了，又存了咋了”“没动，又存上了”“40 万是定期的”“放心吧，这个钱都给你俩”“近 45”“那 5 万呢”“装修房子用了”等内容。结合前述公积金账户录屏、银行入账及转账截图，可以相互印证被告已实际取得并控制至少 450000 元原告款项，并对其中部分款项进行了处分。原告一方要求返还后，被告仍拒不返还。</w:t>
       </w:r>
     </w:p>
     <w:p>
       <w:pPr>
-        <w:spacing w:before="0" w:after="80"/>
-        <w:ind w:firstLine="480"/>
+        <w:spacing w:before="0" w:after="80" w:line="560" w:lineRule="exact"/>
+        <w:ind w:firstLine="560"/>
+        <w:jc w:val="both"/>
       </w:pPr>
       <w:r>
         <w:rPr>
-          <w:rFonts w:ascii="宋体" w:hAnsi="宋体" w:eastAsia="宋体"/>
+          <w:rFonts w:ascii="仿宋_GB2312" w:hAnsi="仿宋_GB2312" w:eastAsia="仿宋_GB2312"/>
           <w:b w:val="0"/>
-          <w:sz w:val="24"/>
+          <w:sz w:val="28"/>
         </w:rPr>
-        <w:t>6. 现阶段，原告依据现有直接转账凭证，仅就已能够明确证明转入被告账户的 450000 元主张返还责任。对同日提取款项中其余部分的具体去向、实际占有人及责任范围，原告保留在补充调取材料后依法变更、增加诉讼请求的权利。</w:t>
+        <w:t>6. 被告取得并占有原告上述款项，无法律依据。即便其主张系代为保管、代为支配或用于其他用途，亦未取得原告合法、真实、有效授权。离婚后，被告既非原告法定代理人，亦非原告财产管理人，在明知该款项属于原告个人财产的情况下仍实际占有并处分，构成无法律根据取得利益并致原告受损，依法应向原告返还。</w:t>
       </w:r>
     </w:p>
     <w:p>
       <w:pPr>
-        <w:spacing w:before="0" w:after="80"/>
-        <w:ind w:firstLine="480"/>
+        <w:spacing w:before="0" w:after="80" w:line="560" w:lineRule="exact"/>
+        <w:ind w:firstLine="560"/>
+        <w:jc w:val="both"/>
       </w:pPr>
       <w:r>
         <w:rPr>
-          <w:rFonts w:ascii="宋体" w:hAnsi="宋体" w:eastAsia="宋体"/>
+          <w:rFonts w:ascii="仿宋_GB2312" w:hAnsi="仿宋_GB2312" w:eastAsia="仿宋_GB2312"/>
           <w:b w:val="0"/>
-          <w:sz w:val="24"/>
+          <w:sz w:val="28"/>
         </w:rPr>
-        <w:t>被告无法律根据取得并占有原告款项 450000 元，且明知无据仍拒绝返还，依据《中华人民共和国民法典》第九百八十五条、第九百八十七条之规定，及《中华人民共和国民事诉讼法》相关规定，特向贵院提起诉讼，请依法判如所请。</w:t>
+        <w:t>7. 现阶段，原告依据现有直接转账凭证，仅就已经能够明确证明转入被告账户的 450000 元主张返还责任。至于同日公积金销户提取款项中其余部分的具体去向、实际占有人及责任范围，以及案涉销户提取的具体办理材料、办理方式，原告保留在补充调取材料后依法变更、增加诉讼请求或补充事实依据的权利。</w:t>
       </w:r>
     </w:p>
     <w:p>
       <w:pPr>
-        <w:spacing w:before="0" w:after="0"/>
-        <w:pBdr>
-          <w:bottom w:val="single" w:sz="4" w:space="1" w:color="auto"/>
-        </w:pBdr>
+        <w:spacing w:before="0" w:after="80" w:line="560" w:lineRule="exact"/>
+        <w:ind w:firstLine="560"/>
+        <w:jc w:val="both"/>
       </w:pPr>
+      <w:r>
+        <w:rPr>
+          <w:rFonts w:ascii="仿宋_GB2312" w:hAnsi="仿宋_GB2312" w:eastAsia="仿宋_GB2312"/>
+          <w:b w:val="0"/>
+          <w:sz w:val="28"/>
+        </w:rPr>
+        <w:t>综上，被告在无法律依据且未经原告合法授权的情况下，取得、占有并处分原告款项 450000 元，依法应当向原告返还并承担相应资金占用利息。依据《中华人民共和国民法典》第九百八十五条、第九百八十七条之规定，以及《中华人民共和国民事诉讼法》相关规定，特向贵院提起诉讼，请依法判如所请。</w:t>
+      </w:r>
     </w:p>
     <w:p>
       <w:pPr>
-        <w:spacing w:before="120" w:after="80"/>
+        <w:spacing w:before="120" w:after="40"/>
+        <w:ind w:firstLine="0"/>
+        <w:jc w:val="left"/>
       </w:pPr>
       <w:r>
         <w:rPr>
-          <w:rFonts w:ascii="宋体" w:hAnsi="宋体" w:eastAsia="宋体"/>
+          <w:rFonts w:ascii="黑体" w:hAnsi="黑体" w:eastAsia="黑体"/>
           <w:b/>
           <w:sz w:val="28"/>
         </w:rPr>
@@ -298,103 +326,118 @@
     </w:p>
     <w:p>
       <w:pPr>
-        <w:spacing w:before="0" w:after="80"/>
-        <w:ind w:firstLine="480"/>
+        <w:spacing w:before="0" w:after="80" w:line="560" w:lineRule="exact"/>
+        <w:ind w:firstLine="560"/>
+        <w:jc w:val="both"/>
       </w:pPr>
       <w:r>
         <w:rPr>
-          <w:rFonts w:ascii="宋体" w:hAnsi="宋体" w:eastAsia="宋体"/>
+          <w:rFonts w:ascii="仿宋_GB2312" w:hAnsi="仿宋_GB2312" w:eastAsia="仿宋_GB2312"/>
           <w:b w:val="0"/>
-          <w:sz w:val="24"/>
+          <w:sz w:val="28"/>
         </w:rPr>
         <w:t>1. 孙瑞河公积金账户明细.mp4，用于证明涉案住房公积金账户归属于原告孙瑞河，账号为 777074552456，并证明该账户于 2026 年 2 月 25 日发生销户提取，提取后账户余额为 0。</w:t>
       </w:r>
     </w:p>
     <w:p>
       <w:pPr>
-        <w:spacing w:before="0" w:after="80"/>
-        <w:ind w:firstLine="480"/>
+        <w:spacing w:before="0" w:after="80" w:line="560" w:lineRule="exact"/>
+        <w:ind w:firstLine="560"/>
+        <w:jc w:val="both"/>
       </w:pPr>
       <w:r>
         <w:rPr>
-          <w:rFonts w:ascii="宋体" w:hAnsi="宋体" w:eastAsia="宋体"/>
+          <w:rFonts w:ascii="仿宋_GB2312" w:hAnsi="仿宋_GB2312" w:eastAsia="仿宋_GB2312"/>
           <w:b w:val="0"/>
-          <w:sz w:val="24"/>
+          <w:sz w:val="28"/>
         </w:rPr>
         <w:t>2. 孙瑞河公积金被提取到银行卡.jpg，用于证明 2026 年 2 月 25 日 13 时 21 分 22 秒，公积金款项 459591.83 元进入尾号 8076 的银行卡。</w:t>
       </w:r>
     </w:p>
     <w:p>
       <w:pPr>
-        <w:spacing w:before="0" w:after="80"/>
-        <w:ind w:firstLine="480"/>
+        <w:spacing w:before="0" w:after="80" w:line="560" w:lineRule="exact"/>
+        <w:ind w:firstLine="560"/>
+        <w:jc w:val="both"/>
       </w:pPr>
       <w:r>
         <w:rPr>
-          <w:rFonts w:ascii="宋体" w:hAnsi="宋体" w:eastAsia="宋体"/>
+          <w:rFonts w:ascii="仿宋_GB2312" w:hAnsi="仿宋_GB2312" w:eastAsia="仿宋_GB2312"/>
           <w:b w:val="0"/>
-          <w:sz w:val="24"/>
+          <w:sz w:val="28"/>
         </w:rPr>
         <w:t>3. 孙瑞河的钱被转账到张政芹的账户.jpg，用于证明 2026 年 2 月 25 日 14 时 18 分 04 秒，尾号 8076 的银行卡向张政芹名下尾号 9075 的农业银行卡转出 450000 元。</w:t>
       </w:r>
     </w:p>
     <w:p>
       <w:pPr>
-        <w:spacing w:before="0" w:after="80"/>
-        <w:ind w:firstLine="480"/>
+        <w:spacing w:before="0" w:after="80" w:line="560" w:lineRule="exact"/>
+        <w:ind w:firstLine="560"/>
+        <w:jc w:val="both"/>
       </w:pPr>
       <w:r>
         <w:rPr>
-          <w:rFonts w:ascii="宋体" w:hAnsi="宋体" w:eastAsia="宋体"/>
+          <w:rFonts w:ascii="仿宋_GB2312" w:hAnsi="仿宋_GB2312" w:eastAsia="仿宋_GB2312"/>
           <w:b w:val="0"/>
-          <w:sz w:val="24"/>
+          <w:sz w:val="28"/>
         </w:rPr>
         <w:t>4. 孙瑞河未知情也未授权.jpg、孙瑞河未知情也未授权.mp4，用于证明原告对涉案款项提取、转移行为并未作出授权。</w:t>
       </w:r>
     </w:p>
     <w:p>
       <w:pPr>
-        <w:spacing w:before="0" w:after="80"/>
-        <w:ind w:firstLine="480"/>
+        <w:spacing w:before="0" w:after="80" w:line="560" w:lineRule="exact"/>
+        <w:ind w:firstLine="560"/>
+        <w:jc w:val="both"/>
       </w:pPr>
       <w:r>
         <w:rPr>
-          <w:rFonts w:ascii="宋体" w:hAnsi="宋体" w:eastAsia="宋体"/>
+          <w:rFonts w:ascii="仿宋_GB2312" w:hAnsi="仿宋_GB2312" w:eastAsia="仿宋_GB2312"/>
           <w:b w:val="0"/>
-          <w:sz w:val="24"/>
+          <w:sz w:val="28"/>
         </w:rPr>
         <w:t>5. 张政芹承认并拒绝返还.png、张政芹承认并拒绝返还2.png、张政芹承认并拒绝返还3.jpg、张政芹承认并拒绝返还4.jpg、张政芹承认并拒绝返还5.jpg、张政芹承认并拒绝返还6.png，用于证明被告承认其已取得、控制并处分涉案款项，且拒绝返还。</w:t>
       </w:r>
     </w:p>
     <w:p>
       <w:pPr>
-        <w:spacing w:before="0" w:after="80"/>
-        <w:ind w:firstLine="480"/>
+        <w:spacing w:before="0" w:after="80" w:line="560" w:lineRule="exact"/>
+        <w:ind w:firstLine="560"/>
+        <w:jc w:val="both"/>
       </w:pPr>
       <w:r>
         <w:rPr>
-          <w:rFonts w:ascii="宋体" w:hAnsi="宋体" w:eastAsia="宋体"/>
+          <w:rFonts w:ascii="仿宋_GB2312" w:hAnsi="仿宋_GB2312" w:eastAsia="仿宋_GB2312"/>
           <w:b w:val="0"/>
-          <w:sz w:val="24"/>
+          <w:sz w:val="28"/>
         </w:rPr>
         <w:t>6. 授权委托书、授权视频、父子关系证明及相关身份证明材料，用于证明孙景峰有权作为委托诉讼代理人代原告参加本案诉讼活动。</w:t>
       </w:r>
     </w:p>
     <w:p>
       <w:pPr>
-        <w:spacing w:before="0" w:after="0"/>
-        <w:pBdr>
-          <w:bottom w:val="single" w:sz="4" w:space="1" w:color="auto"/>
-        </w:pBdr>
+        <w:spacing w:before="0" w:after="80" w:line="560" w:lineRule="exact"/>
+        <w:ind w:firstLine="560"/>
+        <w:jc w:val="both"/>
       </w:pPr>
+      <w:r>
+        <w:rPr>
+          <w:rFonts w:ascii="仿宋_GB2312" w:hAnsi="仿宋_GB2312" w:eastAsia="仿宋_GB2312"/>
+          <w:b w:val="0"/>
+          <w:sz w:val="28"/>
+        </w:rPr>
+        <w:t>7. 原、被告关系材料，原告既往身体状况及居住养老机构相关材料，账户工具控制情况材料，被告带原告就医及案涉身份核验办理线索材料等，部分已掌握，部分将在立案后补充提交或申请法院依法调取。该组证据用于证明原告与被告之间的基础关系、案涉公积金被提取并转入被告账户的事实背景，以及被告能够实际接触原告账户资金并完成认证、转移的原因。</w:t>
+      </w:r>
     </w:p>
     <w:p>
       <w:pPr>
-        <w:spacing w:before="120" w:after="80"/>
+        <w:spacing w:before="120" w:after="40"/>
+        <w:ind w:firstLine="0"/>
+        <w:jc w:val="left"/>
       </w:pPr>
       <w:r>
         <w:rPr>
-          <w:rFonts w:ascii="宋体" w:hAnsi="宋体" w:eastAsia="宋体"/>
+          <w:rFonts w:ascii="黑体" w:hAnsi="黑体" w:eastAsia="黑体"/>
           <w:b/>
           <w:sz w:val="28"/>
         </w:rPr>
@@ -403,99 +446,93 @@
     </w:p>
     <w:p>
       <w:pPr>
-        <w:spacing w:before="0" w:after="80"/>
-        <w:ind w:firstLine="480"/>
+        <w:spacing w:before="0" w:after="80" w:line="560" w:lineRule="exact"/>
+        <w:ind w:firstLine="560"/>
+        <w:jc w:val="both"/>
       </w:pPr>
       <w:r>
         <w:rPr>
-          <w:rFonts w:ascii="宋体" w:hAnsi="宋体" w:eastAsia="宋体"/>
+          <w:rFonts w:ascii="仿宋_GB2312" w:hAnsi="仿宋_GB2312" w:eastAsia="仿宋_GB2312"/>
           <w:b w:val="0"/>
-          <w:sz w:val="24"/>
+          <w:sz w:val="28"/>
         </w:rPr>
-        <w:t>原告依据现已抗握的被告身份信息、联系电话及本案争议事实，向桦甸市人民法院提起诉讼。被告具体住址信息，原告将在后续核实后补充提交。原告同意依法接受电子送达。</w:t>
+        <w:t>原告依据现已掌握的被告身份信息、联系电话及本案争议事实，向桦甸市人民法院提起诉讼。被告具体住址信息，原告将在后续核实后补充提交。原告同意依法接受电子送达。</w:t>
       </w:r>
     </w:p>
     <w:p>
       <w:pPr>
-        <w:spacing w:before="0" w:after="0"/>
-        <w:pBdr>
-          <w:bottom w:val="single" w:sz="4" w:space="1" w:color="auto"/>
-        </w:pBdr>
-      </w:pPr>
-    </w:p>
-    <w:p>
-      <w:pPr>
-        <w:spacing w:before="120" w:after="40"/>
-        <w:ind w:firstLine="480"/>
+        <w:spacing w:before="240" w:after="0"/>
+        <w:jc w:val="left"/>
       </w:pPr>
       <w:r>
         <w:rPr>
-          <w:rFonts w:ascii="宋体" w:hAnsi="宋体" w:eastAsia="宋体"/>
+          <w:rFonts w:ascii="仿宋_GB2312" w:hAnsi="仿宋_GB2312" w:eastAsia="仿宋_GB2312"/>
           <w:b w:val="0"/>
-          <w:sz w:val="24"/>
+          <w:sz w:val="28"/>
         </w:rPr>
         <w:t>此致</w:t>
       </w:r>
     </w:p>
     <w:p>
       <w:pPr>
-        <w:spacing w:before="0" w:after="280"/>
-        <w:ind w:firstLine="960"/>
+        <w:spacing w:before="0" w:after="80" w:line="560" w:lineRule="exact"/>
+        <w:jc w:val="both"/>
       </w:pPr>
       <w:r>
         <w:rPr>
-          <w:rFonts w:ascii="宋体" w:hAnsi="宋体" w:eastAsia="宋体"/>
+          <w:rFonts w:ascii="仿宋_GB2312" w:hAnsi="仿宋_GB2312" w:eastAsia="仿宋_GB2312"/>
           <w:b w:val="0"/>
-          <w:sz w:val="24"/>
+          <w:sz w:val="28"/>
         </w:rPr>
         <w:t>桦甸市人民法院</w:t>
       </w:r>
     </w:p>
+    <w:p/>
     <w:p>
       <w:pPr>
-        <w:spacing w:before="0" w:after="80"/>
+        <w:spacing w:before="120" w:after="40"/>
         <w:jc w:val="right"/>
       </w:pPr>
       <w:r>
         <w:rPr>
-          <w:rFonts w:ascii="宋体" w:hAnsi="宋体" w:eastAsia="宋体"/>
+          <w:rFonts w:ascii="仿宋_GB2312" w:hAnsi="仿宋_GB2312" w:eastAsia="仿宋_GB2312"/>
           <w:b w:val="0"/>
-          <w:sz w:val="24"/>
+          <w:sz w:val="28"/>
         </w:rPr>
         <w:t>具状人（原告）：孙瑞河</w:t>
       </w:r>
     </w:p>
     <w:p>
       <w:pPr>
-        <w:spacing w:before="0" w:after="80"/>
+        <w:spacing w:before="40" w:after="40"/>
         <w:jc w:val="right"/>
       </w:pPr>
       <w:r>
         <w:rPr>
-          <w:rFonts w:ascii="宋体" w:hAnsi="宋体" w:eastAsia="宋体"/>
+          <w:rFonts w:ascii="仿宋_GB2312" w:hAnsi="仿宋_GB2312" w:eastAsia="仿宋_GB2312"/>
           <w:b w:val="0"/>
-          <w:sz w:val="24"/>
+          <w:sz w:val="28"/>
         </w:rPr>
         <w:t>委托诉讼代理人：孙景峰</w:t>
       </w:r>
     </w:p>
     <w:p>
       <w:pPr>
-        <w:spacing w:before="0" w:after="80"/>
+        <w:spacing w:before="40" w:after="0"/>
         <w:jc w:val="right"/>
       </w:pPr>
       <w:r>
         <w:rPr>
-          <w:rFonts w:ascii="宋体" w:hAnsi="宋体" w:eastAsia="宋体"/>
+          <w:rFonts w:ascii="仿宋_GB2312" w:hAnsi="仿宋_GB2312" w:eastAsia="仿宋_GB2312"/>
           <w:b w:val="0"/>
-          <w:sz w:val="24"/>
+          <w:sz w:val="28"/>
         </w:rPr>
-        <w:t>日期：2026 年 4 月 6 日</w:t>
+        <w:t>日期：2026 年 4 月 27 日</w:t>
       </w:r>
     </w:p>
     <w:sectPr>
-      <w:pgSz w:w="11906" w:h="16838"/>
-      <w:pgMar w:top="1417" w:right="1417" w:bottom="1417" w:left="1701" w:header="720" w:footer="720" w:gutter="0"/>
+      <w:pgSz w:w="12240" w:h="15840"/>
+      <w:pgMar w:top="2098" w:right="1474" w:bottom="1984" w:left="1587" w:header="720" w:footer="720" w:gutter="0"/>
       <w:cols w:space="720"/>
       <w:docGrid w:linePitch="360"/>
     </w:sectPr>

</xml_diff>